<commit_message>
docs: add Markdown versions of the 4 project docs, fix stale content found along the way
Same content as the existing Word files, generated from the same source
scripts (only the renderer swapped, docx -> plain Markdown) so the two
formats can't drift apart. Along the way found and fixed two claims stale
in the same way as README's recent fixes: the install guide said "Node.js
20 or newer," and the technical reference still named the design system
"Editorial Paper" instead of the current "refractive dispersion on
soft-body organic geometry" -- both corrected in the source generator and
regenerated into both formats.
</commit_message>
<xml_diff>
--- a/docs/Pepiros - 02 - Installation and Setup Guide.docx
+++ b/docs/Pepiros - 02 - Installation and Setup Guide.docx
@@ -105,7 +105,7 @@
           <w:sz w:val="20"/>
           <w:szCs w:val="20"/>
         </w:rPr>
-        <w:t xml:space="preserve">Node.js 20 or newer (Node 22 recommended)</w:t>
+        <w:t xml:space="preserve">Node.js 22 or newer</w:t>
       </w:r>
     </w:p>
     <w:p>
@@ -171,7 +171,7 @@
           <w:sz w:val="22"/>
           <w:szCs w:val="22"/>
         </w:rPr>
-        <w:t xml:space="preserve">Node.js 20+</w:t>
+        <w:t xml:space="preserve">Node.js 22+</w:t>
       </w:r>
       <w:r>
         <w:rPr>
@@ -198,7 +198,25 @@
           <w:sz w:val="22"/>
           <w:szCs w:val="22"/>
         </w:rPr>
-        <w:t xml:space="preserve"> and CI both pin Node 22).</w:t>
+        <w:t xml:space="preserve"> and </w:t>
+      </w:r>
+      <w:r>
+        <w:rPr>
+          <w:rFonts w:ascii="Consolas" w:cs="Consolas" w:eastAsia="Consolas" w:hAnsi="Consolas"/>
+          <w:color w:val="553780"/>
+          <w:sz w:val="20"/>
+          <w:szCs w:val="20"/>
+        </w:rPr>
+        <w:t xml:space="preserve">package.json</w:t>
+      </w:r>
+      <w:r>
+        <w:rPr>
+          <w:rFonts w:ascii="Georgia" w:cs="Georgia" w:eastAsia="Georgia" w:hAnsi="Georgia"/>
+          <w:color w:val="5C564A"/>
+          <w:sz w:val="22"/>
+          <w:szCs w:val="22"/>
+        </w:rPr>
+        <w:t xml:space="preserve"> engines field both pin this; CI runs Node 22).</w:t>
       </w:r>
     </w:p>
     <w:p>

</xml_diff>